<commit_message>
June drafts for hours, liturgy
</commit_message>
<xml_diff>
--- a/docx_resources/Вечірня-Утреня/tmp_тропарі_Тріоді/тріодь-06.docx
+++ b/docx_resources/Вечірня-Утреня/tmp_тропарі_Тріоді/тріодь-06.docx
@@ -109,10 +109,7 @@
         <w:pStyle w:val="Heading2"/>
       </w:pPr>
       <w:r>
-        <w:t>3</w:t>
-      </w:r>
-      <w:r>
-        <w:t xml:space="preserve"> </w:t>
+        <w:t xml:space="preserve">3 </w:t>
       </w:r>
       <w:r>
         <w:t>червня</w:t>
@@ -199,10 +196,7 @@
         <w:pStyle w:val="Heading2"/>
       </w:pPr>
       <w:r>
-        <w:t>4</w:t>
-      </w:r>
-      <w:r>
-        <w:t xml:space="preserve"> </w:t>
+        <w:t xml:space="preserve">4 </w:t>
       </w:r>
       <w:r>
         <w:t>червня</w:t>
@@ -289,10 +283,7 @@
         <w:pStyle w:val="Heading2"/>
       </w:pPr>
       <w:r>
-        <w:t>5</w:t>
-      </w:r>
-      <w:r>
-        <w:t xml:space="preserve"> </w:t>
+        <w:t xml:space="preserve">5 </w:t>
       </w:r>
       <w:r>
         <w:t>червня</w:t>
@@ -380,19 +371,13 @@
         <w:pStyle w:val="Heading2"/>
       </w:pPr>
       <w:r>
-        <w:t>10</w:t>
-      </w:r>
-      <w:r>
-        <w:t xml:space="preserve"> </w:t>
+        <w:t xml:space="preserve">10 </w:t>
       </w:r>
       <w:r>
         <w:t>червня</w:t>
       </w:r>
       <w:r>
-        <w:t xml:space="preserve">. </w:t>
-      </w:r>
-      <w:r>
-        <w:t>Зішестя Святого Духа</w:t>
+        <w:t>. Зішестя Святого Духа</w:t>
       </w:r>
     </w:p>
     <w:p>
@@ -1103,13 +1088,7 @@
         <w:pStyle w:val="Heading2"/>
       </w:pPr>
       <w:r>
-        <w:t>1</w:t>
-      </w:r>
-      <w:r>
-        <w:t>1</w:t>
-      </w:r>
-      <w:r>
-        <w:t xml:space="preserve"> </w:t>
+        <w:t xml:space="preserve">11 </w:t>
       </w:r>
       <w:r>
         <w:t>червня</w:t>
@@ -1825,13 +1804,7 @@
         <w:pStyle w:val="Heading2"/>
       </w:pPr>
       <w:r>
-        <w:t>1</w:t>
-      </w:r>
-      <w:r>
-        <w:t>2</w:t>
-      </w:r>
-      <w:r>
-        <w:t xml:space="preserve"> </w:t>
+        <w:t xml:space="preserve">12 </w:t>
       </w:r>
       <w:r>
         <w:t>червня</w:t>
@@ -2547,13 +2520,7 @@
         <w:pStyle w:val="Heading2"/>
       </w:pPr>
       <w:r>
-        <w:t>1</w:t>
-      </w:r>
-      <w:r>
-        <w:t>3</w:t>
-      </w:r>
-      <w:r>
-        <w:t xml:space="preserve"> </w:t>
+        <w:t xml:space="preserve">13 </w:t>
       </w:r>
       <w:r>
         <w:t>червня</w:t>
@@ -3269,22 +3236,13 @@
         <w:pStyle w:val="Heading2"/>
       </w:pPr>
       <w:r>
-        <w:t>1</w:t>
-      </w:r>
-      <w:r>
-        <w:t>9</w:t>
-      </w:r>
-      <w:r>
-        <w:t xml:space="preserve"> </w:t>
+        <w:t xml:space="preserve">19 </w:t>
       </w:r>
       <w:r>
         <w:t>червня</w:t>
       </w:r>
       <w:r>
-        <w:t xml:space="preserve">. </w:t>
-      </w:r>
-      <w:r>
-        <w:t>Євхаристії</w:t>
+        <w:t>. Євхаристії</w:t>
       </w:r>
     </w:p>
     <w:p>
@@ -3760,7 +3718,343 @@
           <w:sz w:val="24"/>
           <w:szCs w:val="24"/>
         </w:rPr>
-        <w:t xml:space="preserve"> Ось предлежить Христос на поживу всім,* прийдіте, і припадаючи, поклонімся Христу Богові,* у цих тайнах утаєному,* з умилінням кличучи:* Владико, не опали нас, недостойних, причастям,* але попали гріхи і очисти душі наші.</w:t>
+        <w:t xml:space="preserve"> Ось предлежи</w:t>
+      </w:r>
+      <w:r>
+        <w:rPr>
+          <w:rFonts w:ascii="Times New Roman" w:eastAsia="Times New Roman" w:hAnsi="Times New Roman" w:cs="Times New Roman"/>
+          <w:sz w:val="24"/>
+          <w:szCs w:val="24"/>
+        </w:rPr>
+        <w:t>́</w:t>
+      </w:r>
+      <w:r>
+        <w:rPr>
+          <w:rFonts w:ascii="Times New Roman" w:eastAsia="Times New Roman" w:hAnsi="Times New Roman" w:cs="Times New Roman"/>
+          <w:sz w:val="24"/>
+          <w:szCs w:val="24"/>
+        </w:rPr>
+        <w:t>ть Христо</w:t>
+      </w:r>
+      <w:r>
+        <w:rPr>
+          <w:rFonts w:ascii="Times New Roman" w:eastAsia="Times New Roman" w:hAnsi="Times New Roman" w:cs="Times New Roman"/>
+          <w:sz w:val="24"/>
+          <w:szCs w:val="24"/>
+        </w:rPr>
+        <w:t>́</w:t>
+      </w:r>
+      <w:r>
+        <w:rPr>
+          <w:rFonts w:ascii="Times New Roman" w:eastAsia="Times New Roman" w:hAnsi="Times New Roman" w:cs="Times New Roman"/>
+          <w:sz w:val="24"/>
+          <w:szCs w:val="24"/>
+        </w:rPr>
+        <w:t>с на пожи</w:t>
+      </w:r>
+      <w:r>
+        <w:rPr>
+          <w:rFonts w:ascii="Times New Roman" w:eastAsia="Times New Roman" w:hAnsi="Times New Roman" w:cs="Times New Roman"/>
+          <w:sz w:val="24"/>
+          <w:szCs w:val="24"/>
+        </w:rPr>
+        <w:t>́</w:t>
+      </w:r>
+      <w:r>
+        <w:rPr>
+          <w:rFonts w:ascii="Times New Roman" w:eastAsia="Times New Roman" w:hAnsi="Times New Roman" w:cs="Times New Roman"/>
+          <w:sz w:val="24"/>
+          <w:szCs w:val="24"/>
+        </w:rPr>
+        <w:t>ву всім,* прийді</w:t>
+      </w:r>
+      <w:r>
+        <w:rPr>
+          <w:rFonts w:ascii="Times New Roman" w:eastAsia="Times New Roman" w:hAnsi="Times New Roman" w:cs="Times New Roman"/>
+          <w:sz w:val="24"/>
+          <w:szCs w:val="24"/>
+        </w:rPr>
+        <w:t>́</w:t>
+      </w:r>
+      <w:r>
+        <w:rPr>
+          <w:rFonts w:ascii="Times New Roman" w:eastAsia="Times New Roman" w:hAnsi="Times New Roman" w:cs="Times New Roman"/>
+          <w:sz w:val="24"/>
+          <w:szCs w:val="24"/>
+        </w:rPr>
+        <w:t>те, і припада</w:t>
+      </w:r>
+      <w:r>
+        <w:rPr>
+          <w:rFonts w:ascii="Times New Roman" w:eastAsia="Times New Roman" w:hAnsi="Times New Roman" w:cs="Times New Roman"/>
+          <w:sz w:val="24"/>
+          <w:szCs w:val="24"/>
+        </w:rPr>
+        <w:t>́</w:t>
+      </w:r>
+      <w:r>
+        <w:rPr>
+          <w:rFonts w:ascii="Times New Roman" w:eastAsia="Times New Roman" w:hAnsi="Times New Roman" w:cs="Times New Roman"/>
+          <w:sz w:val="24"/>
+          <w:szCs w:val="24"/>
+        </w:rPr>
+        <w:t>ючи, поклоні</w:t>
+      </w:r>
+      <w:r>
+        <w:rPr>
+          <w:rFonts w:ascii="Times New Roman" w:eastAsia="Times New Roman" w:hAnsi="Times New Roman" w:cs="Times New Roman"/>
+          <w:sz w:val="24"/>
+          <w:szCs w:val="24"/>
+        </w:rPr>
+        <w:t>́</w:t>
+      </w:r>
+      <w:r>
+        <w:rPr>
+          <w:rFonts w:ascii="Times New Roman" w:eastAsia="Times New Roman" w:hAnsi="Times New Roman" w:cs="Times New Roman"/>
+          <w:sz w:val="24"/>
+          <w:szCs w:val="24"/>
+        </w:rPr>
+        <w:t>мся Христу</w:t>
+      </w:r>
+      <w:r>
+        <w:rPr>
+          <w:rFonts w:ascii="Times New Roman" w:eastAsia="Times New Roman" w:hAnsi="Times New Roman" w:cs="Times New Roman"/>
+          <w:sz w:val="24"/>
+          <w:szCs w:val="24"/>
+        </w:rPr>
+        <w:t>́</w:t>
+      </w:r>
+      <w:r>
+        <w:rPr>
+          <w:rFonts w:ascii="Times New Roman" w:eastAsia="Times New Roman" w:hAnsi="Times New Roman" w:cs="Times New Roman"/>
+          <w:sz w:val="24"/>
+          <w:szCs w:val="24"/>
+        </w:rPr>
+        <w:t xml:space="preserve"> Бо</w:t>
+      </w:r>
+      <w:r>
+        <w:rPr>
+          <w:rFonts w:ascii="Times New Roman" w:eastAsia="Times New Roman" w:hAnsi="Times New Roman" w:cs="Times New Roman"/>
+          <w:sz w:val="24"/>
+          <w:szCs w:val="24"/>
+        </w:rPr>
+        <w:t>́</w:t>
+      </w:r>
+      <w:r>
+        <w:rPr>
+          <w:rFonts w:ascii="Times New Roman" w:eastAsia="Times New Roman" w:hAnsi="Times New Roman" w:cs="Times New Roman"/>
+          <w:sz w:val="24"/>
+          <w:szCs w:val="24"/>
+        </w:rPr>
+        <w:t>гові,* у цих та</w:t>
+      </w:r>
+      <w:r>
+        <w:rPr>
+          <w:rFonts w:ascii="Times New Roman" w:eastAsia="Times New Roman" w:hAnsi="Times New Roman" w:cs="Times New Roman"/>
+          <w:sz w:val="24"/>
+          <w:szCs w:val="24"/>
+        </w:rPr>
+        <w:t>́</w:t>
+      </w:r>
+      <w:r>
+        <w:rPr>
+          <w:rFonts w:ascii="Times New Roman" w:eastAsia="Times New Roman" w:hAnsi="Times New Roman" w:cs="Times New Roman"/>
+          <w:sz w:val="24"/>
+          <w:szCs w:val="24"/>
+        </w:rPr>
+        <w:t>йнах утає</w:t>
+      </w:r>
+      <w:r>
+        <w:rPr>
+          <w:rFonts w:ascii="Times New Roman" w:eastAsia="Times New Roman" w:hAnsi="Times New Roman" w:cs="Times New Roman"/>
+          <w:sz w:val="24"/>
+          <w:szCs w:val="24"/>
+        </w:rPr>
+        <w:t>́</w:t>
+      </w:r>
+      <w:r>
+        <w:rPr>
+          <w:rFonts w:ascii="Times New Roman" w:eastAsia="Times New Roman" w:hAnsi="Times New Roman" w:cs="Times New Roman"/>
+          <w:sz w:val="24"/>
+          <w:szCs w:val="24"/>
+        </w:rPr>
+        <w:t>ному,* з умилі</w:t>
+      </w:r>
+      <w:r>
+        <w:rPr>
+          <w:rFonts w:ascii="Times New Roman" w:eastAsia="Times New Roman" w:hAnsi="Times New Roman" w:cs="Times New Roman"/>
+          <w:sz w:val="24"/>
+          <w:szCs w:val="24"/>
+        </w:rPr>
+        <w:t>́</w:t>
+      </w:r>
+      <w:r>
+        <w:rPr>
+          <w:rFonts w:ascii="Times New Roman" w:eastAsia="Times New Roman" w:hAnsi="Times New Roman" w:cs="Times New Roman"/>
+          <w:sz w:val="24"/>
+          <w:szCs w:val="24"/>
+        </w:rPr>
+        <w:t>нням кли</w:t>
+      </w:r>
+      <w:r>
+        <w:rPr>
+          <w:rFonts w:ascii="Times New Roman" w:eastAsia="Times New Roman" w:hAnsi="Times New Roman" w:cs="Times New Roman"/>
+          <w:sz w:val="24"/>
+          <w:szCs w:val="24"/>
+        </w:rPr>
+        <w:t>́</w:t>
+      </w:r>
+      <w:r>
+        <w:rPr>
+          <w:rFonts w:ascii="Times New Roman" w:eastAsia="Times New Roman" w:hAnsi="Times New Roman" w:cs="Times New Roman"/>
+          <w:sz w:val="24"/>
+          <w:szCs w:val="24"/>
+        </w:rPr>
+        <w:t>чучи:* Влади</w:t>
+      </w:r>
+      <w:r>
+        <w:rPr>
+          <w:rFonts w:ascii="Times New Roman" w:eastAsia="Times New Roman" w:hAnsi="Times New Roman" w:cs="Times New Roman"/>
+          <w:sz w:val="24"/>
+          <w:szCs w:val="24"/>
+        </w:rPr>
+        <w:t>́</w:t>
+      </w:r>
+      <w:r>
+        <w:rPr>
+          <w:rFonts w:ascii="Times New Roman" w:eastAsia="Times New Roman" w:hAnsi="Times New Roman" w:cs="Times New Roman"/>
+          <w:sz w:val="24"/>
+          <w:szCs w:val="24"/>
+        </w:rPr>
+        <w:t>ко, не опали</w:t>
+      </w:r>
+      <w:r>
+        <w:rPr>
+          <w:rFonts w:ascii="Times New Roman" w:eastAsia="Times New Roman" w:hAnsi="Times New Roman" w:cs="Times New Roman"/>
+          <w:sz w:val="24"/>
+          <w:szCs w:val="24"/>
+        </w:rPr>
+        <w:t>́</w:t>
+      </w:r>
+      <w:r>
+        <w:rPr>
+          <w:rFonts w:ascii="Times New Roman" w:eastAsia="Times New Roman" w:hAnsi="Times New Roman" w:cs="Times New Roman"/>
+          <w:sz w:val="24"/>
+          <w:szCs w:val="24"/>
+        </w:rPr>
+        <w:t xml:space="preserve"> нас, недосто</w:t>
+      </w:r>
+      <w:r>
+        <w:rPr>
+          <w:rFonts w:ascii="Times New Roman" w:eastAsia="Times New Roman" w:hAnsi="Times New Roman" w:cs="Times New Roman"/>
+          <w:sz w:val="24"/>
+          <w:szCs w:val="24"/>
+        </w:rPr>
+        <w:t>́</w:t>
+      </w:r>
+      <w:r>
+        <w:rPr>
+          <w:rFonts w:ascii="Times New Roman" w:eastAsia="Times New Roman" w:hAnsi="Times New Roman" w:cs="Times New Roman"/>
+          <w:sz w:val="24"/>
+          <w:szCs w:val="24"/>
+        </w:rPr>
+        <w:t>йних, прича</w:t>
+      </w:r>
+      <w:r>
+        <w:rPr>
+          <w:rFonts w:ascii="Times New Roman" w:eastAsia="Times New Roman" w:hAnsi="Times New Roman" w:cs="Times New Roman"/>
+          <w:sz w:val="24"/>
+          <w:szCs w:val="24"/>
+        </w:rPr>
+        <w:t>́</w:t>
+      </w:r>
+      <w:r>
+        <w:rPr>
+          <w:rFonts w:ascii="Times New Roman" w:eastAsia="Times New Roman" w:hAnsi="Times New Roman" w:cs="Times New Roman"/>
+          <w:sz w:val="24"/>
+          <w:szCs w:val="24"/>
+        </w:rPr>
+        <w:t>стям,* але попали</w:t>
+      </w:r>
+      <w:r>
+        <w:rPr>
+          <w:rFonts w:ascii="Times New Roman" w:eastAsia="Times New Roman" w:hAnsi="Times New Roman" w:cs="Times New Roman"/>
+          <w:sz w:val="24"/>
+          <w:szCs w:val="24"/>
+        </w:rPr>
+        <w:t>́</w:t>
+      </w:r>
+      <w:r>
+        <w:rPr>
+          <w:rFonts w:ascii="Times New Roman" w:eastAsia="Times New Roman" w:hAnsi="Times New Roman" w:cs="Times New Roman"/>
+          <w:sz w:val="24"/>
+          <w:szCs w:val="24"/>
+        </w:rPr>
+        <w:t xml:space="preserve"> гріхи</w:t>
+      </w:r>
+      <w:r>
+        <w:rPr>
+          <w:rFonts w:ascii="Times New Roman" w:eastAsia="Times New Roman" w:hAnsi="Times New Roman" w:cs="Times New Roman"/>
+          <w:sz w:val="24"/>
+          <w:szCs w:val="24"/>
+        </w:rPr>
+        <w:t>́</w:t>
+      </w:r>
+      <w:r>
+        <w:rPr>
+          <w:rFonts w:ascii="Times New Roman" w:eastAsia="Times New Roman" w:hAnsi="Times New Roman" w:cs="Times New Roman"/>
+          <w:sz w:val="24"/>
+          <w:szCs w:val="24"/>
+        </w:rPr>
+        <w:t xml:space="preserve"> і очи</w:t>
+      </w:r>
+      <w:r>
+        <w:rPr>
+          <w:rFonts w:ascii="Times New Roman" w:eastAsia="Times New Roman" w:hAnsi="Times New Roman" w:cs="Times New Roman"/>
+          <w:sz w:val="24"/>
+          <w:szCs w:val="24"/>
+        </w:rPr>
+        <w:t>́</w:t>
+      </w:r>
+      <w:r>
+        <w:rPr>
+          <w:rFonts w:ascii="Times New Roman" w:eastAsia="Times New Roman" w:hAnsi="Times New Roman" w:cs="Times New Roman"/>
+          <w:sz w:val="24"/>
+          <w:szCs w:val="24"/>
+        </w:rPr>
+        <w:t>сти ду</w:t>
+      </w:r>
+      <w:r>
+        <w:rPr>
+          <w:rFonts w:ascii="Times New Roman" w:eastAsia="Times New Roman" w:hAnsi="Times New Roman" w:cs="Times New Roman"/>
+          <w:sz w:val="24"/>
+          <w:szCs w:val="24"/>
+        </w:rPr>
+        <w:t>́</w:t>
+      </w:r>
+      <w:r>
+        <w:rPr>
+          <w:rFonts w:ascii="Times New Roman" w:eastAsia="Times New Roman" w:hAnsi="Times New Roman" w:cs="Times New Roman"/>
+          <w:sz w:val="24"/>
+          <w:szCs w:val="24"/>
+        </w:rPr>
+        <w:t>ші на</w:t>
+      </w:r>
+      <w:r>
+        <w:rPr>
+          <w:rFonts w:ascii="Times New Roman" w:eastAsia="Times New Roman" w:hAnsi="Times New Roman" w:cs="Times New Roman"/>
+          <w:sz w:val="24"/>
+          <w:szCs w:val="24"/>
+        </w:rPr>
+        <w:t>́</w:t>
+      </w:r>
+      <w:r>
+        <w:rPr>
+          <w:rFonts w:ascii="Times New Roman" w:eastAsia="Times New Roman" w:hAnsi="Times New Roman" w:cs="Times New Roman"/>
+          <w:sz w:val="24"/>
+          <w:szCs w:val="24"/>
+        </w:rPr>
+        <w:t>ші.</w:t>
       </w:r>
     </w:p>
     <w:p>
@@ -3768,16 +4062,16 @@
         <w:pStyle w:val="Heading2"/>
       </w:pPr>
       <w:r>
-        <w:t>27</w:t>
-      </w:r>
-      <w:r>
-        <w:t xml:space="preserve"> </w:t>
+        <w:t xml:space="preserve">27 </w:t>
       </w:r>
       <w:r>
         <w:t>червня</w:t>
       </w:r>
       <w:r>
-        <w:t>. Зішестя Святого Духа</w:t>
+        <w:t xml:space="preserve">. </w:t>
+      </w:r>
+      <w:r>
+        <w:t>Христа Людинолюбця</w:t>
       </w:r>
     </w:p>
     <w:p>
@@ -3808,16 +4102,43 @@
           <w:sz w:val="24"/>
           <w:szCs w:val="24"/>
         </w:rPr>
-        <w:t xml:space="preserve"> </w:t>
-      </w:r>
-      <w:r>
-        <w:rPr>
-          <w:rFonts w:ascii="Times New Roman" w:eastAsia="Times New Roman" w:hAnsi="Times New Roman" w:cs="Times New Roman"/>
-          <w:color w:val="333333"/>
-          <w:sz w:val="24"/>
-          <w:szCs w:val="24"/>
-        </w:rPr>
-        <w:t>Поми́луй нас, Го́споди, поми́луй нас, * бо, жо́дного оправда́ння не ма́ючи, * оцю́ Тобí моли́тву як Влади́ці ми, грíшні, прино́симо: Поми́луй нас.</w:t>
+        <w:t xml:space="preserve"> Поми́луй нас, Го́споди, поми́луй нас,</w:t>
+      </w:r>
+      <w:r>
+        <w:rPr>
+          <w:rFonts w:ascii="Times New Roman" w:eastAsia="Times New Roman" w:hAnsi="Times New Roman" w:cs="Times New Roman"/>
+          <w:color w:val="333333"/>
+          <w:sz w:val="24"/>
+          <w:szCs w:val="24"/>
+        </w:rPr>
+        <w:t>*</w:t>
+      </w:r>
+      <w:r>
+        <w:rPr>
+          <w:rFonts w:ascii="Times New Roman" w:eastAsia="Times New Roman" w:hAnsi="Times New Roman" w:cs="Times New Roman"/>
+          <w:color w:val="333333"/>
+          <w:sz w:val="24"/>
+          <w:szCs w:val="24"/>
+        </w:rPr>
+        <w:t xml:space="preserve"> бо, жо́дного оправда́ння не ма́ючи,</w:t>
+      </w:r>
+      <w:r>
+        <w:rPr>
+          <w:rFonts w:ascii="Times New Roman" w:eastAsia="Times New Roman" w:hAnsi="Times New Roman" w:cs="Times New Roman"/>
+          <w:color w:val="333333"/>
+          <w:sz w:val="24"/>
+          <w:szCs w:val="24"/>
+        </w:rPr>
+        <w:t>*</w:t>
+      </w:r>
+      <w:r>
+        <w:rPr>
+          <w:rFonts w:ascii="Times New Roman" w:eastAsia="Times New Roman" w:hAnsi="Times New Roman" w:cs="Times New Roman"/>
+          <w:color w:val="333333"/>
+          <w:sz w:val="24"/>
+          <w:szCs w:val="24"/>
+        </w:rPr>
+        <w:t xml:space="preserve"> оцю́ Тобí моли́тву як Влади́ці ми, грíшні, прино́симо: Поми́луй нас.</w:t>
       </w:r>
     </w:p>
     <w:p>
@@ -3825,7 +4146,7 @@
         <w:ind w:hanging="2"/>
         <w:rPr>
           <w:rFonts w:ascii="Times New Roman" w:eastAsia="Times New Roman" w:hAnsi="Times New Roman" w:cs="Times New Roman"/>
-          <w:b/>
+          <w:color w:val="333333"/>
           <w:sz w:val="24"/>
           <w:szCs w:val="24"/>
         </w:rPr>
@@ -3913,7 +4234,25 @@
           <w:sz w:val="24"/>
           <w:szCs w:val="24"/>
         </w:rPr>
-        <w:t>споди, * а</w:t>
+        <w:t>споди,</w:t>
+      </w:r>
+      <w:r>
+        <w:rPr>
+          <w:rFonts w:ascii="Times New Roman" w:eastAsia="Times New Roman" w:hAnsi="Times New Roman" w:cs="Times New Roman"/>
+          <w:color w:val="333333"/>
+          <w:sz w:val="24"/>
+          <w:szCs w:val="24"/>
+        </w:rPr>
+        <w:t>*</w:t>
+      </w:r>
+      <w:r>
+        <w:rPr>
+          <w:rFonts w:ascii="Times New Roman" w:eastAsia="Times New Roman" w:hAnsi="Times New Roman" w:cs="Times New Roman"/>
+          <w:color w:val="333333"/>
+          <w:sz w:val="24"/>
+          <w:szCs w:val="24"/>
+        </w:rPr>
+        <w:t xml:space="preserve"> а</w:t>
       </w:r>
       <w:r>
         <w:rPr>
@@ -3949,7 +4288,25 @@
           <w:sz w:val="24"/>
           <w:szCs w:val="24"/>
         </w:rPr>
-        <w:t>жцю, * я, врято</w:t>
+        <w:t>жцю,</w:t>
+      </w:r>
+      <w:r>
+        <w:rPr>
+          <w:rFonts w:ascii="Times New Roman" w:eastAsia="Times New Roman" w:hAnsi="Times New Roman" w:cs="Times New Roman"/>
+          <w:color w:val="333333"/>
+          <w:sz w:val="24"/>
+          <w:szCs w:val="24"/>
+        </w:rPr>
+        <w:t>*</w:t>
+      </w:r>
+      <w:r>
+        <w:rPr>
+          <w:rFonts w:ascii="Times New Roman" w:eastAsia="Times New Roman" w:hAnsi="Times New Roman" w:cs="Times New Roman"/>
+          <w:color w:val="333333"/>
+          <w:sz w:val="24"/>
+          <w:szCs w:val="24"/>
+        </w:rPr>
+        <w:t xml:space="preserve"> я, врято</w:t>
       </w:r>
       <w:r>
         <w:rPr>
@@ -4003,7 +4360,25 @@
           <w:sz w:val="24"/>
           <w:szCs w:val="24"/>
         </w:rPr>
-        <w:t>рти, * похвалу</w:t>
+        <w:t>рти,</w:t>
+      </w:r>
+      <w:r>
+        <w:rPr>
+          <w:rFonts w:ascii="Times New Roman" w:eastAsia="Times New Roman" w:hAnsi="Times New Roman" w:cs="Times New Roman"/>
+          <w:color w:val="333333"/>
+          <w:sz w:val="24"/>
+          <w:szCs w:val="24"/>
+        </w:rPr>
+        <w:t>*</w:t>
+      </w:r>
+      <w:r>
+        <w:rPr>
+          <w:rFonts w:ascii="Times New Roman" w:eastAsia="Times New Roman" w:hAnsi="Times New Roman" w:cs="Times New Roman"/>
+          <w:color w:val="333333"/>
+          <w:sz w:val="24"/>
+          <w:szCs w:val="24"/>
+        </w:rPr>
+        <w:t xml:space="preserve"> похвалу</w:t>
       </w:r>
       <w:r>
         <w:rPr>
@@ -4075,7 +4450,25 @@
           <w:sz w:val="24"/>
           <w:szCs w:val="24"/>
         </w:rPr>
-        <w:t>ння і раб Твій, * але</w:t>
+        <w:t>ння і раб Твій,</w:t>
+      </w:r>
+      <w:r>
+        <w:rPr>
+          <w:rFonts w:ascii="Times New Roman" w:eastAsia="Times New Roman" w:hAnsi="Times New Roman" w:cs="Times New Roman"/>
+          <w:color w:val="333333"/>
+          <w:sz w:val="24"/>
+          <w:szCs w:val="24"/>
+        </w:rPr>
+        <w:t>*</w:t>
+      </w:r>
+      <w:r>
+        <w:rPr>
+          <w:rFonts w:ascii="Times New Roman" w:eastAsia="Times New Roman" w:hAnsi="Times New Roman" w:cs="Times New Roman"/>
+          <w:color w:val="333333"/>
+          <w:sz w:val="24"/>
+          <w:szCs w:val="24"/>
+        </w:rPr>
+        <w:t xml:space="preserve"> але</w:t>
       </w:r>
       <w:r>
         <w:rPr>
@@ -4147,7 +4540,25 @@
           <w:sz w:val="24"/>
           <w:szCs w:val="24"/>
         </w:rPr>
-        <w:t>нне, * від уся</w:t>
+        <w:t>нне,</w:t>
+      </w:r>
+      <w:r>
+        <w:rPr>
+          <w:rFonts w:ascii="Times New Roman" w:eastAsia="Times New Roman" w:hAnsi="Times New Roman" w:cs="Times New Roman"/>
+          <w:color w:val="333333"/>
+          <w:sz w:val="24"/>
+          <w:szCs w:val="24"/>
+        </w:rPr>
+        <w:t>*</w:t>
+      </w:r>
+      <w:r>
+        <w:rPr>
+          <w:rFonts w:ascii="Times New Roman" w:eastAsia="Times New Roman" w:hAnsi="Times New Roman" w:cs="Times New Roman"/>
+          <w:color w:val="333333"/>
+          <w:sz w:val="24"/>
+          <w:szCs w:val="24"/>
+        </w:rPr>
+        <w:t xml:space="preserve"> від уся</w:t>
       </w:r>
       <w:r>
         <w:rPr>
@@ -4219,7 +4630,25 @@
           <w:sz w:val="24"/>
           <w:szCs w:val="24"/>
         </w:rPr>
-        <w:t>ю: * Ісу</w:t>
+        <w:t>ю:</w:t>
+      </w:r>
+      <w:r>
+        <w:rPr>
+          <w:rFonts w:ascii="Times New Roman" w:eastAsia="Times New Roman" w:hAnsi="Times New Roman" w:cs="Times New Roman"/>
+          <w:color w:val="333333"/>
+          <w:sz w:val="24"/>
+          <w:szCs w:val="24"/>
+        </w:rPr>
+        <w:t>*</w:t>
+      </w:r>
+      <w:r>
+        <w:rPr>
+          <w:rFonts w:ascii="Times New Roman" w:eastAsia="Times New Roman" w:hAnsi="Times New Roman" w:cs="Times New Roman"/>
+          <w:color w:val="333333"/>
+          <w:sz w:val="24"/>
+          <w:szCs w:val="24"/>
+        </w:rPr>
+        <w:t xml:space="preserve"> Ісу</w:t>
       </w:r>
       <w:r>
         <w:rPr>
@@ -4310,6 +4739,1050 @@
           <w:szCs w:val="24"/>
         </w:rPr>
         <w:t>.</w:t>
+      </w:r>
+    </w:p>
+    <w:p>
+      <w:pPr>
+        <w:pStyle w:val="Heading2"/>
+      </w:pPr>
+      <w:r>
+        <w:t>2</w:t>
+      </w:r>
+      <w:r>
+        <w:rPr>
+          <w:lang w:val="en-US"/>
+        </w:rPr>
+        <w:t>8</w:t>
+      </w:r>
+      <w:r>
+        <w:t xml:space="preserve"> червня. </w:t>
+      </w:r>
+      <w:r>
+        <w:t>Сострадання</w:t>
+      </w:r>
+    </w:p>
+    <w:p>
+      <w:pPr>
+        <w:spacing w:after="120" w:line="240" w:lineRule="auto"/>
+        <w:rPr>
+          <w:rFonts w:ascii="Times New Roman" w:eastAsia="Times New Roman" w:hAnsi="Times New Roman" w:cs="Times New Roman"/>
+          <w:sz w:val="24"/>
+          <w:szCs w:val="24"/>
+        </w:rPr>
+      </w:pPr>
+      <w:r>
+        <w:rPr>
+          <w:rFonts w:ascii="Times New Roman" w:eastAsia="Times New Roman" w:hAnsi="Times New Roman" w:cs="Times New Roman"/>
+          <w:i/>
+          <w:iCs/>
+          <w:color w:val="FF4400"/>
+          <w:sz w:val="24"/>
+          <w:szCs w:val="24"/>
+        </w:rPr>
+        <w:t>Тропар (г. 6):</w:t>
+      </w:r>
+      <w:r>
+        <w:rPr>
+          <w:rFonts w:ascii="Times New Roman" w:eastAsia="Times New Roman" w:hAnsi="Times New Roman" w:cs="Times New Roman"/>
+          <w:color w:val="333333"/>
+          <w:sz w:val="24"/>
+          <w:szCs w:val="24"/>
+        </w:rPr>
+        <w:t xml:space="preserve"> З ученико</w:t>
+      </w:r>
+      <w:r>
+        <w:rPr>
+          <w:rFonts w:ascii="Times New Roman" w:eastAsia="Times New Roman" w:hAnsi="Times New Roman" w:cs="Times New Roman"/>
+          <w:color w:val="333333"/>
+          <w:sz w:val="24"/>
+          <w:szCs w:val="24"/>
+        </w:rPr>
+        <w:t>́</w:t>
+      </w:r>
+      <w:r>
+        <w:rPr>
+          <w:rFonts w:ascii="Times New Roman" w:eastAsia="Times New Roman" w:hAnsi="Times New Roman" w:cs="Times New Roman"/>
+          <w:color w:val="333333"/>
+          <w:sz w:val="24"/>
+          <w:szCs w:val="24"/>
+        </w:rPr>
+        <w:t>м ді</w:t>
+      </w:r>
+      <w:r>
+        <w:rPr>
+          <w:rFonts w:ascii="Times New Roman" w:eastAsia="Times New Roman" w:hAnsi="Times New Roman" w:cs="Times New Roman"/>
+          <w:color w:val="333333"/>
+          <w:sz w:val="24"/>
+          <w:szCs w:val="24"/>
+        </w:rPr>
+        <w:t>́</w:t>
+      </w:r>
+      <w:r>
+        <w:rPr>
+          <w:rFonts w:ascii="Times New Roman" w:eastAsia="Times New Roman" w:hAnsi="Times New Roman" w:cs="Times New Roman"/>
+          <w:color w:val="333333"/>
+          <w:sz w:val="24"/>
+          <w:szCs w:val="24"/>
+        </w:rPr>
+        <w:t>вственником* Ма</w:t>
+      </w:r>
+      <w:r>
+        <w:rPr>
+          <w:rFonts w:ascii="Times New Roman" w:eastAsia="Times New Roman" w:hAnsi="Times New Roman" w:cs="Times New Roman"/>
+          <w:color w:val="333333"/>
+          <w:sz w:val="24"/>
+          <w:szCs w:val="24"/>
+        </w:rPr>
+        <w:t>́</w:t>
+      </w:r>
+      <w:r>
+        <w:rPr>
+          <w:rFonts w:ascii="Times New Roman" w:eastAsia="Times New Roman" w:hAnsi="Times New Roman" w:cs="Times New Roman"/>
+          <w:color w:val="333333"/>
+          <w:sz w:val="24"/>
+          <w:szCs w:val="24"/>
+        </w:rPr>
+        <w:t>ти Ді</w:t>
+      </w:r>
+      <w:r>
+        <w:rPr>
+          <w:rFonts w:ascii="Times New Roman" w:eastAsia="Times New Roman" w:hAnsi="Times New Roman" w:cs="Times New Roman"/>
+          <w:color w:val="333333"/>
+          <w:sz w:val="24"/>
+          <w:szCs w:val="24"/>
+        </w:rPr>
+        <w:t>́</w:t>
+      </w:r>
+      <w:r>
+        <w:rPr>
+          <w:rFonts w:ascii="Times New Roman" w:eastAsia="Times New Roman" w:hAnsi="Times New Roman" w:cs="Times New Roman"/>
+          <w:color w:val="333333"/>
+          <w:sz w:val="24"/>
+          <w:szCs w:val="24"/>
+        </w:rPr>
+        <w:t>ва стоя</w:t>
+      </w:r>
+      <w:r>
+        <w:rPr>
+          <w:rFonts w:ascii="Times New Roman" w:eastAsia="Times New Roman" w:hAnsi="Times New Roman" w:cs="Times New Roman"/>
+          <w:color w:val="333333"/>
+          <w:sz w:val="24"/>
+          <w:szCs w:val="24"/>
+        </w:rPr>
+        <w:t>́</w:t>
+      </w:r>
+      <w:r>
+        <w:rPr>
+          <w:rFonts w:ascii="Times New Roman" w:eastAsia="Times New Roman" w:hAnsi="Times New Roman" w:cs="Times New Roman"/>
+          <w:color w:val="333333"/>
+          <w:sz w:val="24"/>
+          <w:szCs w:val="24"/>
+        </w:rPr>
+        <w:t>ла перед хресто</w:t>
+      </w:r>
+      <w:r>
+        <w:rPr>
+          <w:rFonts w:ascii="Times New Roman" w:eastAsia="Times New Roman" w:hAnsi="Times New Roman" w:cs="Times New Roman"/>
+          <w:color w:val="333333"/>
+          <w:sz w:val="24"/>
+          <w:szCs w:val="24"/>
+        </w:rPr>
+        <w:t>́</w:t>
+      </w:r>
+      <w:r>
+        <w:rPr>
+          <w:rFonts w:ascii="Times New Roman" w:eastAsia="Times New Roman" w:hAnsi="Times New Roman" w:cs="Times New Roman"/>
+          <w:color w:val="333333"/>
+          <w:sz w:val="24"/>
+          <w:szCs w:val="24"/>
+        </w:rPr>
+        <w:t>м Того</w:t>
+      </w:r>
+      <w:r>
+        <w:rPr>
+          <w:rFonts w:ascii="Times New Roman" w:eastAsia="Times New Roman" w:hAnsi="Times New Roman" w:cs="Times New Roman"/>
+          <w:color w:val="333333"/>
+          <w:sz w:val="24"/>
+          <w:szCs w:val="24"/>
+        </w:rPr>
+        <w:t>́</w:t>
+      </w:r>
+      <w:r>
+        <w:rPr>
+          <w:rFonts w:ascii="Times New Roman" w:eastAsia="Times New Roman" w:hAnsi="Times New Roman" w:cs="Times New Roman"/>
+          <w:color w:val="333333"/>
+          <w:sz w:val="24"/>
+          <w:szCs w:val="24"/>
+        </w:rPr>
+        <w:t>, що з не</w:t>
+      </w:r>
+      <w:r>
+        <w:rPr>
+          <w:rFonts w:ascii="Times New Roman" w:eastAsia="Times New Roman" w:hAnsi="Times New Roman" w:cs="Times New Roman"/>
+          <w:color w:val="333333"/>
+          <w:sz w:val="24"/>
+          <w:szCs w:val="24"/>
+        </w:rPr>
+        <w:t>́</w:t>
+      </w:r>
+      <w:r>
+        <w:rPr>
+          <w:rFonts w:ascii="Times New Roman" w:eastAsia="Times New Roman" w:hAnsi="Times New Roman" w:cs="Times New Roman"/>
+          <w:color w:val="333333"/>
+          <w:sz w:val="24"/>
+          <w:szCs w:val="24"/>
+        </w:rPr>
+        <w:t>ї роди</w:t>
+      </w:r>
+      <w:r>
+        <w:rPr>
+          <w:rFonts w:ascii="Times New Roman" w:eastAsia="Times New Roman" w:hAnsi="Times New Roman" w:cs="Times New Roman"/>
+          <w:color w:val="333333"/>
+          <w:sz w:val="24"/>
+          <w:szCs w:val="24"/>
+        </w:rPr>
+        <w:t>́</w:t>
+      </w:r>
+      <w:r>
+        <w:rPr>
+          <w:rFonts w:ascii="Times New Roman" w:eastAsia="Times New Roman" w:hAnsi="Times New Roman" w:cs="Times New Roman"/>
+          <w:color w:val="333333"/>
+          <w:sz w:val="24"/>
+          <w:szCs w:val="24"/>
+        </w:rPr>
+        <w:t>вся,* і не мі</w:t>
+      </w:r>
+      <w:r>
+        <w:rPr>
+          <w:rFonts w:ascii="Times New Roman" w:eastAsia="Times New Roman" w:hAnsi="Times New Roman" w:cs="Times New Roman"/>
+          <w:color w:val="333333"/>
+          <w:sz w:val="24"/>
+          <w:szCs w:val="24"/>
+        </w:rPr>
+        <w:t>́</w:t>
+      </w:r>
+      <w:r>
+        <w:rPr>
+          <w:rFonts w:ascii="Times New Roman" w:eastAsia="Times New Roman" w:hAnsi="Times New Roman" w:cs="Times New Roman"/>
+          <w:color w:val="333333"/>
+          <w:sz w:val="24"/>
+          <w:szCs w:val="24"/>
+        </w:rPr>
+        <w:t>гши гляді</w:t>
+      </w:r>
+      <w:r>
+        <w:rPr>
+          <w:rFonts w:ascii="Times New Roman" w:eastAsia="Times New Roman" w:hAnsi="Times New Roman" w:cs="Times New Roman"/>
+          <w:color w:val="333333"/>
+          <w:sz w:val="24"/>
+          <w:szCs w:val="24"/>
+        </w:rPr>
+        <w:t>́</w:t>
+      </w:r>
+      <w:r>
+        <w:rPr>
+          <w:rFonts w:ascii="Times New Roman" w:eastAsia="Times New Roman" w:hAnsi="Times New Roman" w:cs="Times New Roman"/>
+          <w:color w:val="333333"/>
+          <w:sz w:val="24"/>
+          <w:szCs w:val="24"/>
+        </w:rPr>
+        <w:t>ти на Ньо</w:t>
+      </w:r>
+      <w:r>
+        <w:rPr>
+          <w:rFonts w:ascii="Times New Roman" w:eastAsia="Times New Roman" w:hAnsi="Times New Roman" w:cs="Times New Roman"/>
+          <w:color w:val="333333"/>
+          <w:sz w:val="24"/>
+          <w:szCs w:val="24"/>
+        </w:rPr>
+        <w:t>́</w:t>
+      </w:r>
+      <w:r>
+        <w:rPr>
+          <w:rFonts w:ascii="Times New Roman" w:eastAsia="Times New Roman" w:hAnsi="Times New Roman" w:cs="Times New Roman"/>
+          <w:color w:val="333333"/>
+          <w:sz w:val="24"/>
+          <w:szCs w:val="24"/>
+        </w:rPr>
+        <w:t>го, як Його</w:t>
+      </w:r>
+      <w:r>
+        <w:rPr>
+          <w:rFonts w:ascii="Times New Roman" w:eastAsia="Times New Roman" w:hAnsi="Times New Roman" w:cs="Times New Roman"/>
+          <w:color w:val="333333"/>
+          <w:sz w:val="24"/>
+          <w:szCs w:val="24"/>
+        </w:rPr>
+        <w:t>́</w:t>
+      </w:r>
+      <w:r>
+        <w:rPr>
+          <w:rFonts w:ascii="Times New Roman" w:eastAsia="Times New Roman" w:hAnsi="Times New Roman" w:cs="Times New Roman"/>
+          <w:color w:val="333333"/>
+          <w:sz w:val="24"/>
+          <w:szCs w:val="24"/>
+        </w:rPr>
+        <w:t xml:space="preserve"> підно</w:t>
+      </w:r>
+      <w:r>
+        <w:rPr>
+          <w:rFonts w:ascii="Times New Roman" w:eastAsia="Times New Roman" w:hAnsi="Times New Roman" w:cs="Times New Roman"/>
+          <w:color w:val="333333"/>
+          <w:sz w:val="24"/>
+          <w:szCs w:val="24"/>
+        </w:rPr>
+        <w:t>́</w:t>
+      </w:r>
+      <w:r>
+        <w:rPr>
+          <w:rFonts w:ascii="Times New Roman" w:eastAsia="Times New Roman" w:hAnsi="Times New Roman" w:cs="Times New Roman"/>
+          <w:color w:val="333333"/>
+          <w:sz w:val="24"/>
+          <w:szCs w:val="24"/>
+        </w:rPr>
+        <w:t>сили на хрест,* кли</w:t>
+      </w:r>
+      <w:r>
+        <w:rPr>
+          <w:rFonts w:ascii="Times New Roman" w:eastAsia="Times New Roman" w:hAnsi="Times New Roman" w:cs="Times New Roman"/>
+          <w:color w:val="333333"/>
+          <w:sz w:val="24"/>
+          <w:szCs w:val="24"/>
+        </w:rPr>
+        <w:t>́</w:t>
+      </w:r>
+      <w:r>
+        <w:rPr>
+          <w:rFonts w:ascii="Times New Roman" w:eastAsia="Times New Roman" w:hAnsi="Times New Roman" w:cs="Times New Roman"/>
+          <w:color w:val="333333"/>
+          <w:sz w:val="24"/>
+          <w:szCs w:val="24"/>
+        </w:rPr>
+        <w:t>кала, звору</w:t>
+      </w:r>
+      <w:r>
+        <w:rPr>
+          <w:rFonts w:ascii="Times New Roman" w:eastAsia="Times New Roman" w:hAnsi="Times New Roman" w:cs="Times New Roman"/>
+          <w:color w:val="333333"/>
+          <w:sz w:val="24"/>
+          <w:szCs w:val="24"/>
+        </w:rPr>
+        <w:t>́</w:t>
+      </w:r>
+      <w:r>
+        <w:rPr>
+          <w:rFonts w:ascii="Times New Roman" w:eastAsia="Times New Roman" w:hAnsi="Times New Roman" w:cs="Times New Roman"/>
+          <w:color w:val="333333"/>
+          <w:sz w:val="24"/>
+          <w:szCs w:val="24"/>
+        </w:rPr>
+        <w:t>шена рида</w:t>
+      </w:r>
+      <w:r>
+        <w:rPr>
+          <w:rFonts w:ascii="Times New Roman" w:eastAsia="Times New Roman" w:hAnsi="Times New Roman" w:cs="Times New Roman"/>
+          <w:color w:val="333333"/>
+          <w:sz w:val="24"/>
+          <w:szCs w:val="24"/>
+        </w:rPr>
+        <w:t>́</w:t>
+      </w:r>
+      <w:r>
+        <w:rPr>
+          <w:rFonts w:ascii="Times New Roman" w:eastAsia="Times New Roman" w:hAnsi="Times New Roman" w:cs="Times New Roman"/>
+          <w:color w:val="333333"/>
+          <w:sz w:val="24"/>
+          <w:szCs w:val="24"/>
+        </w:rPr>
+        <w:t>ннями:* Як стражда</w:t>
+      </w:r>
+      <w:r>
+        <w:rPr>
+          <w:rFonts w:ascii="Times New Roman" w:eastAsia="Times New Roman" w:hAnsi="Times New Roman" w:cs="Times New Roman"/>
+          <w:color w:val="333333"/>
+          <w:sz w:val="24"/>
+          <w:szCs w:val="24"/>
+        </w:rPr>
+        <w:t>́</w:t>
+      </w:r>
+      <w:r>
+        <w:rPr>
+          <w:rFonts w:ascii="Times New Roman" w:eastAsia="Times New Roman" w:hAnsi="Times New Roman" w:cs="Times New Roman"/>
+          <w:color w:val="333333"/>
+          <w:sz w:val="24"/>
+          <w:szCs w:val="24"/>
+        </w:rPr>
+        <w:t>єш Ти, що єство</w:t>
+      </w:r>
+      <w:r>
+        <w:rPr>
+          <w:rFonts w:ascii="Times New Roman" w:eastAsia="Times New Roman" w:hAnsi="Times New Roman" w:cs="Times New Roman"/>
+          <w:color w:val="333333"/>
+          <w:sz w:val="24"/>
+          <w:szCs w:val="24"/>
+        </w:rPr>
+        <w:t>́</w:t>
+      </w:r>
+      <w:r>
+        <w:rPr>
+          <w:rFonts w:ascii="Times New Roman" w:eastAsia="Times New Roman" w:hAnsi="Times New Roman" w:cs="Times New Roman"/>
+          <w:color w:val="333333"/>
+          <w:sz w:val="24"/>
+          <w:szCs w:val="24"/>
+        </w:rPr>
+        <w:t>м безстра</w:t>
+      </w:r>
+      <w:r>
+        <w:rPr>
+          <w:rFonts w:ascii="Times New Roman" w:eastAsia="Times New Roman" w:hAnsi="Times New Roman" w:cs="Times New Roman"/>
+          <w:color w:val="333333"/>
+          <w:sz w:val="24"/>
+          <w:szCs w:val="24"/>
+        </w:rPr>
+        <w:t>́</w:t>
+      </w:r>
+      <w:r>
+        <w:rPr>
+          <w:rFonts w:ascii="Times New Roman" w:eastAsia="Times New Roman" w:hAnsi="Times New Roman" w:cs="Times New Roman"/>
+          <w:color w:val="333333"/>
+          <w:sz w:val="24"/>
+          <w:szCs w:val="24"/>
+        </w:rPr>
+        <w:t>сний?* Сла</w:t>
+      </w:r>
+      <w:r>
+        <w:rPr>
+          <w:rFonts w:ascii="Times New Roman" w:eastAsia="Times New Roman" w:hAnsi="Times New Roman" w:cs="Times New Roman"/>
+          <w:color w:val="333333"/>
+          <w:sz w:val="24"/>
+          <w:szCs w:val="24"/>
+        </w:rPr>
+        <w:t>́</w:t>
+      </w:r>
+      <w:r>
+        <w:rPr>
+          <w:rFonts w:ascii="Times New Roman" w:eastAsia="Times New Roman" w:hAnsi="Times New Roman" w:cs="Times New Roman"/>
+          <w:color w:val="333333"/>
+          <w:sz w:val="24"/>
+          <w:szCs w:val="24"/>
+        </w:rPr>
+        <w:t>влю Твою</w:t>
+      </w:r>
+      <w:r>
+        <w:rPr>
+          <w:rFonts w:ascii="Times New Roman" w:eastAsia="Times New Roman" w:hAnsi="Times New Roman" w:cs="Times New Roman"/>
+          <w:color w:val="333333"/>
+          <w:sz w:val="24"/>
+          <w:szCs w:val="24"/>
+        </w:rPr>
+        <w:t>́</w:t>
+      </w:r>
+      <w:r>
+        <w:rPr>
+          <w:rFonts w:ascii="Times New Roman" w:eastAsia="Times New Roman" w:hAnsi="Times New Roman" w:cs="Times New Roman"/>
+          <w:color w:val="333333"/>
+          <w:sz w:val="24"/>
+          <w:szCs w:val="24"/>
+        </w:rPr>
+        <w:t>, Си</w:t>
+      </w:r>
+      <w:r>
+        <w:rPr>
+          <w:rFonts w:ascii="Times New Roman" w:eastAsia="Times New Roman" w:hAnsi="Times New Roman" w:cs="Times New Roman"/>
+          <w:color w:val="333333"/>
+          <w:sz w:val="24"/>
+          <w:szCs w:val="24"/>
+        </w:rPr>
+        <w:t>́</w:t>
+      </w:r>
+      <w:r>
+        <w:rPr>
+          <w:rFonts w:ascii="Times New Roman" w:eastAsia="Times New Roman" w:hAnsi="Times New Roman" w:cs="Times New Roman"/>
+          <w:color w:val="333333"/>
+          <w:sz w:val="24"/>
+          <w:szCs w:val="24"/>
+        </w:rPr>
+        <w:t>ну мій, несказа</w:t>
+      </w:r>
+      <w:r>
+        <w:rPr>
+          <w:rFonts w:ascii="Times New Roman" w:eastAsia="Times New Roman" w:hAnsi="Times New Roman" w:cs="Times New Roman"/>
+          <w:color w:val="333333"/>
+          <w:sz w:val="24"/>
+          <w:szCs w:val="24"/>
+        </w:rPr>
+        <w:t>́</w:t>
+      </w:r>
+      <w:r>
+        <w:rPr>
+          <w:rFonts w:ascii="Times New Roman" w:eastAsia="Times New Roman" w:hAnsi="Times New Roman" w:cs="Times New Roman"/>
+          <w:color w:val="333333"/>
+          <w:sz w:val="24"/>
+          <w:szCs w:val="24"/>
+        </w:rPr>
+        <w:t>нну до</w:t>
+      </w:r>
+      <w:r>
+        <w:rPr>
+          <w:rFonts w:ascii="Times New Roman" w:eastAsia="Times New Roman" w:hAnsi="Times New Roman" w:cs="Times New Roman"/>
+          <w:color w:val="333333"/>
+          <w:sz w:val="24"/>
+          <w:szCs w:val="24"/>
+        </w:rPr>
+        <w:t>́</w:t>
+      </w:r>
+      <w:r>
+        <w:rPr>
+          <w:rFonts w:ascii="Times New Roman" w:eastAsia="Times New Roman" w:hAnsi="Times New Roman" w:cs="Times New Roman"/>
+          <w:color w:val="333333"/>
+          <w:sz w:val="24"/>
+          <w:szCs w:val="24"/>
+        </w:rPr>
+        <w:t>брість,* що вся</w:t>
+      </w:r>
+      <w:r>
+        <w:rPr>
+          <w:rFonts w:ascii="Times New Roman" w:eastAsia="Times New Roman" w:hAnsi="Times New Roman" w:cs="Times New Roman"/>
+          <w:color w:val="333333"/>
+          <w:sz w:val="24"/>
+          <w:szCs w:val="24"/>
+        </w:rPr>
+        <w:t>́</w:t>
+      </w:r>
+      <w:r>
+        <w:rPr>
+          <w:rFonts w:ascii="Times New Roman" w:eastAsia="Times New Roman" w:hAnsi="Times New Roman" w:cs="Times New Roman"/>
+          <w:color w:val="333333"/>
+          <w:sz w:val="24"/>
+          <w:szCs w:val="24"/>
+        </w:rPr>
+        <w:t>кий ум переви</w:t>
+      </w:r>
+      <w:r>
+        <w:rPr>
+          <w:rFonts w:ascii="Times New Roman" w:eastAsia="Times New Roman" w:hAnsi="Times New Roman" w:cs="Times New Roman"/>
+          <w:color w:val="333333"/>
+          <w:sz w:val="24"/>
+          <w:szCs w:val="24"/>
+        </w:rPr>
+        <w:t>́</w:t>
+      </w:r>
+      <w:r>
+        <w:rPr>
+          <w:rFonts w:ascii="Times New Roman" w:eastAsia="Times New Roman" w:hAnsi="Times New Roman" w:cs="Times New Roman"/>
+          <w:color w:val="333333"/>
+          <w:sz w:val="24"/>
+          <w:szCs w:val="24"/>
+        </w:rPr>
+        <w:t>щує.</w:t>
+      </w:r>
+    </w:p>
+    <w:p>
+      <w:r>
+        <w:rPr>
+          <w:rFonts w:ascii="Times New Roman" w:eastAsia="Times New Roman" w:hAnsi="Times New Roman" w:cs="Times New Roman"/>
+          <w:i/>
+          <w:iCs/>
+          <w:color w:val="FF4400"/>
+          <w:sz w:val="24"/>
+          <w:szCs w:val="24"/>
+        </w:rPr>
+        <w:t>Кондак (г. 4):</w:t>
+      </w:r>
+      <w:r>
+        <w:rPr>
+          <w:rFonts w:ascii="Times New Roman" w:eastAsia="Times New Roman" w:hAnsi="Times New Roman" w:cs="Times New Roman"/>
+          <w:color w:val="333333"/>
+          <w:sz w:val="24"/>
+          <w:szCs w:val="24"/>
+        </w:rPr>
+        <w:t xml:space="preserve"> Ви</w:t>
+      </w:r>
+      <w:r>
+        <w:rPr>
+          <w:rFonts w:ascii="Times New Roman" w:eastAsia="Times New Roman" w:hAnsi="Times New Roman" w:cs="Times New Roman"/>
+          <w:color w:val="333333"/>
+          <w:sz w:val="24"/>
+          <w:szCs w:val="24"/>
+        </w:rPr>
+        <w:t>́</w:t>
+      </w:r>
+      <w:r>
+        <w:rPr>
+          <w:rFonts w:ascii="Times New Roman" w:eastAsia="Times New Roman" w:hAnsi="Times New Roman" w:cs="Times New Roman"/>
+          <w:color w:val="333333"/>
+          <w:sz w:val="24"/>
+          <w:szCs w:val="24"/>
+        </w:rPr>
+        <w:t>дячи, як Тебе</w:t>
+      </w:r>
+      <w:r>
+        <w:rPr>
+          <w:rFonts w:ascii="Times New Roman" w:eastAsia="Times New Roman" w:hAnsi="Times New Roman" w:cs="Times New Roman"/>
+          <w:color w:val="333333"/>
+          <w:sz w:val="24"/>
+          <w:szCs w:val="24"/>
+        </w:rPr>
+        <w:t>́</w:t>
+      </w:r>
+      <w:r>
+        <w:rPr>
+          <w:rFonts w:ascii="Times New Roman" w:eastAsia="Times New Roman" w:hAnsi="Times New Roman" w:cs="Times New Roman"/>
+          <w:color w:val="333333"/>
+          <w:sz w:val="24"/>
+          <w:szCs w:val="24"/>
+        </w:rPr>
+        <w:t xml:space="preserve"> на хрест прибива</w:t>
+      </w:r>
+      <w:r>
+        <w:rPr>
+          <w:rFonts w:ascii="Times New Roman" w:eastAsia="Times New Roman" w:hAnsi="Times New Roman" w:cs="Times New Roman"/>
+          <w:color w:val="333333"/>
+          <w:sz w:val="24"/>
+          <w:szCs w:val="24"/>
+        </w:rPr>
+        <w:t>́</w:t>
+      </w:r>
+      <w:r>
+        <w:rPr>
+          <w:rFonts w:ascii="Times New Roman" w:eastAsia="Times New Roman" w:hAnsi="Times New Roman" w:cs="Times New Roman"/>
+          <w:color w:val="333333"/>
+          <w:sz w:val="24"/>
+          <w:szCs w:val="24"/>
+        </w:rPr>
+        <w:t>ють, Ісу</w:t>
+      </w:r>
+      <w:r>
+        <w:rPr>
+          <w:rFonts w:ascii="Times New Roman" w:eastAsia="Times New Roman" w:hAnsi="Times New Roman" w:cs="Times New Roman"/>
+          <w:color w:val="333333"/>
+          <w:sz w:val="24"/>
+          <w:szCs w:val="24"/>
+        </w:rPr>
+        <w:t>́</w:t>
+      </w:r>
+      <w:r>
+        <w:rPr>
+          <w:rFonts w:ascii="Times New Roman" w:eastAsia="Times New Roman" w:hAnsi="Times New Roman" w:cs="Times New Roman"/>
+          <w:color w:val="333333"/>
+          <w:sz w:val="24"/>
+          <w:szCs w:val="24"/>
+        </w:rPr>
+        <w:t>се,* і як Ти доброві</w:t>
+      </w:r>
+      <w:r>
+        <w:rPr>
+          <w:rFonts w:ascii="Times New Roman" w:eastAsia="Times New Roman" w:hAnsi="Times New Roman" w:cs="Times New Roman"/>
+          <w:color w:val="333333"/>
+          <w:sz w:val="24"/>
+          <w:szCs w:val="24"/>
+        </w:rPr>
+        <w:t>́</w:t>
+      </w:r>
+      <w:r>
+        <w:rPr>
+          <w:rFonts w:ascii="Times New Roman" w:eastAsia="Times New Roman" w:hAnsi="Times New Roman" w:cs="Times New Roman"/>
+          <w:color w:val="333333"/>
+          <w:sz w:val="24"/>
+          <w:szCs w:val="24"/>
+        </w:rPr>
+        <w:t>льно стра</w:t>
+      </w:r>
+      <w:r>
+        <w:rPr>
+          <w:rFonts w:ascii="Times New Roman" w:eastAsia="Times New Roman" w:hAnsi="Times New Roman" w:cs="Times New Roman"/>
+          <w:color w:val="333333"/>
+          <w:sz w:val="24"/>
+          <w:szCs w:val="24"/>
+        </w:rPr>
+        <w:t>́</w:t>
+      </w:r>
+      <w:r>
+        <w:rPr>
+          <w:rFonts w:ascii="Times New Roman" w:eastAsia="Times New Roman" w:hAnsi="Times New Roman" w:cs="Times New Roman"/>
+          <w:color w:val="333333"/>
+          <w:sz w:val="24"/>
+          <w:szCs w:val="24"/>
+        </w:rPr>
+        <w:t>сті прийма</w:t>
+      </w:r>
+      <w:r>
+        <w:rPr>
+          <w:rFonts w:ascii="Times New Roman" w:eastAsia="Times New Roman" w:hAnsi="Times New Roman" w:cs="Times New Roman"/>
+          <w:color w:val="333333"/>
+          <w:sz w:val="24"/>
+          <w:szCs w:val="24"/>
+        </w:rPr>
+        <w:t>́</w:t>
+      </w:r>
+      <w:r>
+        <w:rPr>
+          <w:rFonts w:ascii="Times New Roman" w:eastAsia="Times New Roman" w:hAnsi="Times New Roman" w:cs="Times New Roman"/>
+          <w:color w:val="333333"/>
+          <w:sz w:val="24"/>
+          <w:szCs w:val="24"/>
+        </w:rPr>
+        <w:t>єш, Влади</w:t>
+      </w:r>
+      <w:r>
+        <w:rPr>
+          <w:rFonts w:ascii="Times New Roman" w:eastAsia="Times New Roman" w:hAnsi="Times New Roman" w:cs="Times New Roman"/>
+          <w:color w:val="333333"/>
+          <w:sz w:val="24"/>
+          <w:szCs w:val="24"/>
+        </w:rPr>
+        <w:t>́</w:t>
+      </w:r>
+      <w:r>
+        <w:rPr>
+          <w:rFonts w:ascii="Times New Roman" w:eastAsia="Times New Roman" w:hAnsi="Times New Roman" w:cs="Times New Roman"/>
+          <w:color w:val="333333"/>
+          <w:sz w:val="24"/>
+          <w:szCs w:val="24"/>
+        </w:rPr>
+        <w:t>ко,* Ді</w:t>
+      </w:r>
+      <w:r>
+        <w:rPr>
+          <w:rFonts w:ascii="Times New Roman" w:eastAsia="Times New Roman" w:hAnsi="Times New Roman" w:cs="Times New Roman"/>
+          <w:color w:val="333333"/>
+          <w:sz w:val="24"/>
+          <w:szCs w:val="24"/>
+        </w:rPr>
+        <w:t>́</w:t>
+      </w:r>
+      <w:r>
+        <w:rPr>
+          <w:rFonts w:ascii="Times New Roman" w:eastAsia="Times New Roman" w:hAnsi="Times New Roman" w:cs="Times New Roman"/>
+          <w:color w:val="333333"/>
+          <w:sz w:val="24"/>
+          <w:szCs w:val="24"/>
+        </w:rPr>
+        <w:t>ва і Ма</w:t>
+      </w:r>
+      <w:r>
+        <w:rPr>
+          <w:rFonts w:ascii="Times New Roman" w:eastAsia="Times New Roman" w:hAnsi="Times New Roman" w:cs="Times New Roman"/>
+          <w:color w:val="333333"/>
+          <w:sz w:val="24"/>
+          <w:szCs w:val="24"/>
+        </w:rPr>
+        <w:t>́</w:t>
+      </w:r>
+      <w:r>
+        <w:rPr>
+          <w:rFonts w:ascii="Times New Roman" w:eastAsia="Times New Roman" w:hAnsi="Times New Roman" w:cs="Times New Roman"/>
+          <w:color w:val="333333"/>
+          <w:sz w:val="24"/>
+          <w:szCs w:val="24"/>
+        </w:rPr>
+        <w:t>ти Твоя</w:t>
+      </w:r>
+      <w:r>
+        <w:rPr>
+          <w:rFonts w:ascii="Times New Roman" w:eastAsia="Times New Roman" w:hAnsi="Times New Roman" w:cs="Times New Roman"/>
+          <w:color w:val="333333"/>
+          <w:sz w:val="24"/>
+          <w:szCs w:val="24"/>
+        </w:rPr>
+        <w:t>́</w:t>
+      </w:r>
+      <w:r>
+        <w:rPr>
+          <w:rFonts w:ascii="Times New Roman" w:eastAsia="Times New Roman" w:hAnsi="Times New Roman" w:cs="Times New Roman"/>
+          <w:color w:val="333333"/>
+          <w:sz w:val="24"/>
+          <w:szCs w:val="24"/>
+        </w:rPr>
+        <w:t xml:space="preserve"> кли</w:t>
+      </w:r>
+      <w:r>
+        <w:rPr>
+          <w:rFonts w:ascii="Times New Roman" w:eastAsia="Times New Roman" w:hAnsi="Times New Roman" w:cs="Times New Roman"/>
+          <w:color w:val="333333"/>
+          <w:sz w:val="24"/>
+          <w:szCs w:val="24"/>
+        </w:rPr>
+        <w:t>́</w:t>
+      </w:r>
+      <w:r>
+        <w:rPr>
+          <w:rFonts w:ascii="Times New Roman" w:eastAsia="Times New Roman" w:hAnsi="Times New Roman" w:cs="Times New Roman"/>
+          <w:color w:val="333333"/>
+          <w:sz w:val="24"/>
+          <w:szCs w:val="24"/>
+        </w:rPr>
+        <w:t>кала:* Го</w:t>
+      </w:r>
+      <w:r>
+        <w:rPr>
+          <w:rFonts w:ascii="Times New Roman" w:eastAsia="Times New Roman" w:hAnsi="Times New Roman" w:cs="Times New Roman"/>
+          <w:color w:val="333333"/>
+          <w:sz w:val="24"/>
+          <w:szCs w:val="24"/>
+        </w:rPr>
+        <w:t>́</w:t>
+      </w:r>
+      <w:r>
+        <w:rPr>
+          <w:rFonts w:ascii="Times New Roman" w:eastAsia="Times New Roman" w:hAnsi="Times New Roman" w:cs="Times New Roman"/>
+          <w:color w:val="333333"/>
+          <w:sz w:val="24"/>
+          <w:szCs w:val="24"/>
+        </w:rPr>
+        <w:t>ре мені</w:t>
+      </w:r>
+      <w:r>
+        <w:rPr>
+          <w:rFonts w:ascii="Times New Roman" w:eastAsia="Times New Roman" w:hAnsi="Times New Roman" w:cs="Times New Roman"/>
+          <w:color w:val="333333"/>
+          <w:sz w:val="24"/>
+          <w:szCs w:val="24"/>
+        </w:rPr>
+        <w:t>́</w:t>
+      </w:r>
+      <w:r>
+        <w:rPr>
+          <w:rFonts w:ascii="Times New Roman" w:eastAsia="Times New Roman" w:hAnsi="Times New Roman" w:cs="Times New Roman"/>
+          <w:color w:val="333333"/>
+          <w:sz w:val="24"/>
+          <w:szCs w:val="24"/>
+        </w:rPr>
+        <w:t>, Дитя</w:t>
+      </w:r>
+      <w:r>
+        <w:rPr>
+          <w:rFonts w:ascii="Times New Roman" w:eastAsia="Times New Roman" w:hAnsi="Times New Roman" w:cs="Times New Roman"/>
+          <w:color w:val="333333"/>
+          <w:sz w:val="24"/>
+          <w:szCs w:val="24"/>
+        </w:rPr>
+        <w:t>́</w:t>
+      </w:r>
+      <w:r>
+        <w:rPr>
+          <w:rFonts w:ascii="Times New Roman" w:eastAsia="Times New Roman" w:hAnsi="Times New Roman" w:cs="Times New Roman"/>
+          <w:color w:val="333333"/>
+          <w:sz w:val="24"/>
+          <w:szCs w:val="24"/>
+        </w:rPr>
+        <w:t xml:space="preserve"> соло</w:t>
+      </w:r>
+      <w:r>
+        <w:rPr>
+          <w:rFonts w:ascii="Times New Roman" w:eastAsia="Times New Roman" w:hAnsi="Times New Roman" w:cs="Times New Roman"/>
+          <w:color w:val="333333"/>
+          <w:sz w:val="24"/>
+          <w:szCs w:val="24"/>
+        </w:rPr>
+        <w:t>́</w:t>
+      </w:r>
+      <w:r>
+        <w:rPr>
+          <w:rFonts w:ascii="Times New Roman" w:eastAsia="Times New Roman" w:hAnsi="Times New Roman" w:cs="Times New Roman"/>
+          <w:color w:val="333333"/>
+          <w:sz w:val="24"/>
+          <w:szCs w:val="24"/>
+        </w:rPr>
+        <w:t>дке.* Як несправедли</w:t>
+      </w:r>
+      <w:r>
+        <w:rPr>
+          <w:rFonts w:ascii="Times New Roman" w:eastAsia="Times New Roman" w:hAnsi="Times New Roman" w:cs="Times New Roman"/>
+          <w:color w:val="333333"/>
+          <w:sz w:val="24"/>
+          <w:szCs w:val="24"/>
+        </w:rPr>
+        <w:t>́</w:t>
+      </w:r>
+      <w:r>
+        <w:rPr>
+          <w:rFonts w:ascii="Times New Roman" w:eastAsia="Times New Roman" w:hAnsi="Times New Roman" w:cs="Times New Roman"/>
+          <w:color w:val="333333"/>
+          <w:sz w:val="24"/>
+          <w:szCs w:val="24"/>
+        </w:rPr>
+        <w:t>во ра</w:t>
+      </w:r>
+      <w:r>
+        <w:rPr>
+          <w:rFonts w:ascii="Times New Roman" w:eastAsia="Times New Roman" w:hAnsi="Times New Roman" w:cs="Times New Roman"/>
+          <w:color w:val="333333"/>
+          <w:sz w:val="24"/>
+          <w:szCs w:val="24"/>
+        </w:rPr>
+        <w:t>́</w:t>
+      </w:r>
+      <w:r>
+        <w:rPr>
+          <w:rFonts w:ascii="Times New Roman" w:eastAsia="Times New Roman" w:hAnsi="Times New Roman" w:cs="Times New Roman"/>
+          <w:color w:val="333333"/>
+          <w:sz w:val="24"/>
+          <w:szCs w:val="24"/>
+        </w:rPr>
+        <w:t>ни те</w:t>
+      </w:r>
+      <w:r>
+        <w:rPr>
+          <w:rFonts w:ascii="Times New Roman" w:eastAsia="Times New Roman" w:hAnsi="Times New Roman" w:cs="Times New Roman"/>
+          <w:color w:val="333333"/>
+          <w:sz w:val="24"/>
+          <w:szCs w:val="24"/>
+        </w:rPr>
+        <w:t>́</w:t>
+      </w:r>
+      <w:r>
+        <w:rPr>
+          <w:rFonts w:ascii="Times New Roman" w:eastAsia="Times New Roman" w:hAnsi="Times New Roman" w:cs="Times New Roman"/>
+          <w:color w:val="333333"/>
+          <w:sz w:val="24"/>
+          <w:szCs w:val="24"/>
+        </w:rPr>
+        <w:t>рпиш, Зціли</w:t>
+      </w:r>
+      <w:r>
+        <w:rPr>
+          <w:rFonts w:ascii="Times New Roman" w:eastAsia="Times New Roman" w:hAnsi="Times New Roman" w:cs="Times New Roman"/>
+          <w:color w:val="333333"/>
+          <w:sz w:val="24"/>
+          <w:szCs w:val="24"/>
+        </w:rPr>
+        <w:t>́</w:t>
+      </w:r>
+      <w:r>
+        <w:rPr>
+          <w:rFonts w:ascii="Times New Roman" w:eastAsia="Times New Roman" w:hAnsi="Times New Roman" w:cs="Times New Roman"/>
+          <w:color w:val="333333"/>
+          <w:sz w:val="24"/>
+          <w:szCs w:val="24"/>
+        </w:rPr>
+        <w:t>телю людсько</w:t>
+      </w:r>
+      <w:r>
+        <w:rPr>
+          <w:rFonts w:ascii="Times New Roman" w:eastAsia="Times New Roman" w:hAnsi="Times New Roman" w:cs="Times New Roman"/>
+          <w:color w:val="333333"/>
+          <w:sz w:val="24"/>
+          <w:szCs w:val="24"/>
+        </w:rPr>
+        <w:t>́</w:t>
+      </w:r>
+      <w:r>
+        <w:rPr>
+          <w:rFonts w:ascii="Times New Roman" w:eastAsia="Times New Roman" w:hAnsi="Times New Roman" w:cs="Times New Roman"/>
+          <w:color w:val="333333"/>
+          <w:sz w:val="24"/>
+          <w:szCs w:val="24"/>
+        </w:rPr>
+        <w:t>ї не</w:t>
+      </w:r>
+      <w:r>
+        <w:rPr>
+          <w:rFonts w:ascii="Times New Roman" w:eastAsia="Times New Roman" w:hAnsi="Times New Roman" w:cs="Times New Roman"/>
+          <w:color w:val="333333"/>
+          <w:sz w:val="24"/>
+          <w:szCs w:val="24"/>
+        </w:rPr>
+        <w:t>́</w:t>
+      </w:r>
+      <w:r>
+        <w:rPr>
+          <w:rFonts w:ascii="Times New Roman" w:eastAsia="Times New Roman" w:hAnsi="Times New Roman" w:cs="Times New Roman"/>
+          <w:color w:val="333333"/>
+          <w:sz w:val="24"/>
+          <w:szCs w:val="24"/>
+        </w:rPr>
+        <w:t>мочі,* що від зотлі</w:t>
+      </w:r>
+      <w:r>
+        <w:rPr>
+          <w:rFonts w:ascii="Times New Roman" w:eastAsia="Times New Roman" w:hAnsi="Times New Roman" w:cs="Times New Roman"/>
+          <w:color w:val="333333"/>
+          <w:sz w:val="24"/>
+          <w:szCs w:val="24"/>
+        </w:rPr>
+        <w:t>́</w:t>
+      </w:r>
+      <w:r>
+        <w:rPr>
+          <w:rFonts w:ascii="Times New Roman" w:eastAsia="Times New Roman" w:hAnsi="Times New Roman" w:cs="Times New Roman"/>
+          <w:color w:val="333333"/>
+          <w:sz w:val="24"/>
+          <w:szCs w:val="24"/>
+        </w:rPr>
+        <w:t>ння ізба</w:t>
+      </w:r>
+      <w:r>
+        <w:rPr>
+          <w:rFonts w:ascii="Times New Roman" w:eastAsia="Times New Roman" w:hAnsi="Times New Roman" w:cs="Times New Roman"/>
+          <w:color w:val="333333"/>
+          <w:sz w:val="24"/>
+          <w:szCs w:val="24"/>
+        </w:rPr>
+        <w:t>́</w:t>
+      </w:r>
+      <w:r>
+        <w:rPr>
+          <w:rFonts w:ascii="Times New Roman" w:eastAsia="Times New Roman" w:hAnsi="Times New Roman" w:cs="Times New Roman"/>
+          <w:color w:val="333333"/>
+          <w:sz w:val="24"/>
+          <w:szCs w:val="24"/>
+        </w:rPr>
+        <w:t>вив усі</w:t>
+      </w:r>
+      <w:r>
+        <w:rPr>
+          <w:rFonts w:ascii="Times New Roman" w:eastAsia="Times New Roman" w:hAnsi="Times New Roman" w:cs="Times New Roman"/>
+          <w:color w:val="333333"/>
+          <w:sz w:val="24"/>
+          <w:szCs w:val="24"/>
+        </w:rPr>
+        <w:t>́</w:t>
+      </w:r>
+      <w:r>
+        <w:rPr>
+          <w:rFonts w:ascii="Times New Roman" w:eastAsia="Times New Roman" w:hAnsi="Times New Roman" w:cs="Times New Roman"/>
+          <w:color w:val="333333"/>
+          <w:sz w:val="24"/>
+          <w:szCs w:val="24"/>
+        </w:rPr>
+        <w:t>х милосе</w:t>
+      </w:r>
+      <w:r>
+        <w:rPr>
+          <w:rFonts w:ascii="Times New Roman" w:eastAsia="Times New Roman" w:hAnsi="Times New Roman" w:cs="Times New Roman"/>
+          <w:color w:val="333333"/>
+          <w:sz w:val="24"/>
+          <w:szCs w:val="24"/>
+        </w:rPr>
+        <w:t>́</w:t>
+      </w:r>
+      <w:r>
+        <w:rPr>
+          <w:rFonts w:ascii="Times New Roman" w:eastAsia="Times New Roman" w:hAnsi="Times New Roman" w:cs="Times New Roman"/>
+          <w:color w:val="333333"/>
+          <w:sz w:val="24"/>
+          <w:szCs w:val="24"/>
+        </w:rPr>
+        <w:t>рдям свої</w:t>
+      </w:r>
+      <w:r>
+        <w:rPr>
+          <w:rFonts w:ascii="Times New Roman" w:eastAsia="Times New Roman" w:hAnsi="Times New Roman" w:cs="Times New Roman"/>
+          <w:color w:val="333333"/>
+          <w:sz w:val="24"/>
+          <w:szCs w:val="24"/>
+        </w:rPr>
+        <w:t>́</w:t>
+      </w:r>
+      <w:r>
+        <w:rPr>
+          <w:rFonts w:ascii="Times New Roman" w:eastAsia="Times New Roman" w:hAnsi="Times New Roman" w:cs="Times New Roman"/>
+          <w:color w:val="333333"/>
+          <w:sz w:val="24"/>
+          <w:szCs w:val="24"/>
+        </w:rPr>
+        <w:t>м.</w:t>
       </w:r>
     </w:p>
     <w:sectPr>

</xml_diff>